<commit_message>
T-0048: rebuild the guide's HTML, DOCX and PDF after the accuracy fixes
Claude-Session: https://claude.ai/code/session_01TVtpgC8Ad23DQsSGD1ngVF
</commit_message>
<xml_diff>
--- a/docs/guides/crew/crew-1.0-guide.docx
+++ b/docs/guides/crew/crew-1.0-guide.docx
@@ -2183,7 +2183,35 @@
       </w:pPr>
       <w:r>
         <w:rPr/>
-        <w:t xml:space="preserve">Every hook that can block ships disabled: </w:t>
+        <w:t>What is on by default, and what is not:</w:t>
+      </w:r>
+    </w:p>
+    <w:p>
+      <w:pPr>
+        <w:pStyle w:val="BodyText"/>
+        <w:numPr>
+          <w:ilvl w:val="0"/>
+          <w:numId w:val="4"/>
+        </w:numPr>
+        <w:tabs>
+          <w:tab w:val="clear" w:pos="1134"/>
+          <w:tab w:val="left" w:pos="829" w:leader="none"/>
+        </w:tabs>
+        <w:bidi w:val="0"/>
+        <w:spacing w:before="120" w:after="0"/>
+        <w:ind w:hanging="283" w:left="829"/>
+        <w:jc w:val="left"/>
+        <w:rPr/>
+      </w:pPr>
+      <w:r>
+        <w:rPr>
+          <w:rStyle w:val="Strong"/>
+        </w:rPr>
+        <w:t>Off until you arm it:</w:t>
+      </w:r>
+      <w:r>
+        <w:rPr/>
+        <w:t xml:space="preserve"> the scope guard (</w:t>
       </w:r>
       <w:r>
         <w:rPr>
@@ -2213,7 +2241,151 @@
       </w:r>
       <w:r>
         <w:rPr/>
-        <w:t xml:space="preserve"> set it, and </w:t>
+        <w:t xml:space="preserve"> set it), the cloud guard's hook (</w:t>
+      </w:r>
+      <w:r>
+        <w:rPr>
+          <w:rStyle w:val="SourceText"/>
+        </w:rPr>
+        <w:t>guards.cloudGuard: off</w:t>
+      </w:r>
+      <w:r>
+        <w:rPr/>
+        <w:t>) and the role-write guard (</w:t>
+      </w:r>
+      <w:r>
+        <w:rPr>
+          <w:rStyle w:val="SourceText"/>
+        </w:rPr>
+        <w:t>guards.roleWrites: off</w:t>
+      </w:r>
+      <w:r>
+        <w:rPr/>
+        <w:t xml:space="preserve">). </w:t>
+      </w:r>
+    </w:p>
+    <w:p>
+      <w:pPr>
+        <w:pStyle w:val="BodyText"/>
+        <w:numPr>
+          <w:ilvl w:val="0"/>
+          <w:numId w:val="4"/>
+        </w:numPr>
+        <w:tabs>
+          <w:tab w:val="clear" w:pos="1134"/>
+          <w:tab w:val="left" w:pos="829" w:leader="none"/>
+        </w:tabs>
+        <w:bidi w:val="0"/>
+        <w:spacing w:before="120" w:after="0"/>
+        <w:ind w:hanging="283" w:left="829"/>
+        <w:jc w:val="left"/>
+        <w:rPr/>
+      </w:pPr>
+      <w:r>
+        <w:rPr>
+          <w:rStyle w:val="SourceText"/>
+        </w:rPr>
+        <w:t>block</w:t>
+      </w:r>
+      <w:r>
+        <w:rPr>
+          <w:rStyle w:val="Strong"/>
+        </w:rPr>
+        <w:t xml:space="preserve"> by default:</w:t>
+      </w:r>
+      <w:r>
+        <w:rPr/>
+        <w:t xml:space="preserve"> the six policy guards (</w:t>
+      </w:r>
+      <w:r>
+        <w:rPr>
+          <w:rStyle w:val="SourceText"/>
+        </w:rPr>
+        <w:t>guards.terraformApply</w:t>
+      </w:r>
+      <w:r>
+        <w:rPr/>
+        <w:t xml:space="preserve">, </w:t>
+      </w:r>
+      <w:r>
+        <w:rPr>
+          <w:rStyle w:val="SourceText"/>
+        </w:rPr>
+        <w:t>forcePush</w:t>
+      </w:r>
+      <w:r>
+        <w:rPr/>
+        <w:t xml:space="preserve">, </w:t>
+      </w:r>
+      <w:r>
+        <w:rPr>
+          <w:rStyle w:val="SourceText"/>
+        </w:rPr>
+        <w:t>adminMerge</w:t>
+      </w:r>
+      <w:r>
+        <w:rPr/>
+        <w:t xml:space="preserve">, </w:t>
+      </w:r>
+      <w:r>
+        <w:rPr>
+          <w:rStyle w:val="SourceText"/>
+        </w:rPr>
+        <w:t>mergeGate</w:t>
+      </w:r>
+      <w:r>
+        <w:rPr/>
+        <w:t xml:space="preserve">, </w:t>
+      </w:r>
+      <w:r>
+        <w:rPr>
+          <w:rStyle w:val="SourceText"/>
+        </w:rPr>
+        <w:t>cloudDestructive</w:t>
+      </w:r>
+      <w:r>
+        <w:rPr/>
+        <w:t xml:space="preserve">, </w:t>
+      </w:r>
+      <w:r>
+        <w:rPr>
+          <w:rStyle w:val="SourceText"/>
+        </w:rPr>
+        <w:t>sqlDestructive</w:t>
+      </w:r>
+      <w:r>
+        <w:rPr/>
+        <w:t>) and the two production guards (</w:t>
+      </w:r>
+      <w:r>
+        <w:rPr>
+          <w:rStyle w:val="SourceText"/>
+        </w:rPr>
+        <w:t>prodDatabase</w:t>
+      </w:r>
+      <w:r>
+        <w:rPr/>
+        <w:t xml:space="preserve">, </w:t>
+      </w:r>
+      <w:r>
+        <w:rPr>
+          <w:rStyle w:val="SourceText"/>
+        </w:rPr>
+        <w:t>prodServer</w:t>
+      </w:r>
+      <w:r>
+        <w:rPr/>
+        <w:t xml:space="preserve">, which default to </w:t>
+      </w:r>
+      <w:r>
+        <w:rPr>
+          <w:rStyle w:val="SourceText"/>
+        </w:rPr>
+        <w:t>none</w:t>
+      </w:r>
+      <w:r>
+        <w:rPr/>
+        <w:t xml:space="preserve">). The policy guards take effect only once </w:t>
       </w:r>
       <w:r>
         <w:rPr>
@@ -2223,27 +2395,64 @@
       </w:r>
       <w:r>
         <w:rPr/>
-        <w:t xml:space="preserve"> and </w:t>
-      </w:r>
-      <w:r>
-        <w:rPr>
-          <w:rStyle w:val="SourceText"/>
-        </w:rPr>
-        <w:t>guards.roleWrites</w:t>
-      </w:r>
-      <w:r>
-        <w:rPr/>
-        <w:t xml:space="preserve"> are </w:t>
-      </w:r>
-      <w:r>
-        <w:rPr>
-          <w:rStyle w:val="SourceText"/>
-        </w:rPr>
-        <w:t>off</w:t>
-      </w:r>
-      <w:r>
-        <w:rPr/>
-        <w:t>.</w:t>
+        <w:t xml:space="preserve"> is armed, except </w:t>
+      </w:r>
+      <w:r>
+        <w:rPr>
+          <w:rStyle w:val="SourceText"/>
+        </w:rPr>
+        <w:t>mergeGate</w:t>
+      </w:r>
+      <w:r>
+        <w:rPr/>
+        <w:t xml:space="preserve">, which </w:t>
+      </w:r>
+      <w:r>
+        <w:rPr>
+          <w:rStyle w:val="SourceText"/>
+        </w:rPr>
+        <w:t>/crew:gate</w:t>
+      </w:r>
+      <w:r>
+        <w:rPr/>
+        <w:t xml:space="preserve"> reads. </w:t>
+      </w:r>
+    </w:p>
+    <w:p>
+      <w:pPr>
+        <w:pStyle w:val="BodyText"/>
+        <w:numPr>
+          <w:ilvl w:val="0"/>
+          <w:numId w:val="4"/>
+        </w:numPr>
+        <w:tabs>
+          <w:tab w:val="clear" w:pos="1134"/>
+          <w:tab w:val="left" w:pos="829" w:leader="none"/>
+        </w:tabs>
+        <w:bidi w:val="0"/>
+        <w:ind w:hanging="283" w:left="829"/>
+        <w:jc w:val="left"/>
+        <w:rPr/>
+      </w:pPr>
+      <w:r>
+        <w:rPr>
+          <w:rStyle w:val="Strong"/>
+        </w:rPr>
+        <w:t>On by default:</w:t>
+      </w:r>
+      <w:r>
+        <w:rPr/>
+        <w:t xml:space="preserve"> the Stop verify gate (</w:t>
+      </w:r>
+      <w:r>
+        <w:rPr>
+          <w:rStyle w:val="SourceText"/>
+        </w:rPr>
+        <w:t>verifyGate: true</w:t>
+      </w:r>
+      <w:r>
+        <w:rPr/>
+        <w:t xml:space="preserve">) blocks when a verify rule fails. </w:t>
       </w:r>
     </w:p>
     <w:p>
@@ -2638,7 +2847,7 @@
         <w:pStyle w:val="BodyText"/>
         <w:numPr>
           <w:ilvl w:val="0"/>
-          <w:numId w:val="4"/>
+          <w:numId w:val="5"/>
         </w:numPr>
         <w:tabs>
           <w:tab w:val="clear" w:pos="1134"/>
@@ -2660,7 +2869,7 @@
         <w:pStyle w:val="BodyText"/>
         <w:numPr>
           <w:ilvl w:val="0"/>
-          <w:numId w:val="4"/>
+          <w:numId w:val="5"/>
         </w:numPr>
         <w:tabs>
           <w:tab w:val="clear" w:pos="1134"/>
@@ -2692,7 +2901,7 @@
         <w:pStyle w:val="BodyText"/>
         <w:numPr>
           <w:ilvl w:val="0"/>
-          <w:numId w:val="4"/>
+          <w:numId w:val="5"/>
         </w:numPr>
         <w:tabs>
           <w:tab w:val="clear" w:pos="1134"/>
@@ -3039,7 +3248,7 @@
         <w:pStyle w:val="BodyText"/>
         <w:numPr>
           <w:ilvl w:val="0"/>
-          <w:numId w:val="5"/>
+          <w:numId w:val="6"/>
         </w:numPr>
         <w:tabs>
           <w:tab w:val="clear" w:pos="1134"/>
@@ -3070,168 +3279,6 @@
       <w:r>
         <w:rPr/>
         <w:t xml:space="preserve"> sets it, and the scope guard and the audit judge each worktree's edits against its own ticket. </w:t>
-      </w:r>
-    </w:p>
-    <w:p>
-      <w:pPr>
-        <w:pStyle w:val="BodyText"/>
-        <w:numPr>
-          <w:ilvl w:val="0"/>
-          <w:numId w:val="5"/>
-        </w:numPr>
-        <w:tabs>
-          <w:tab w:val="clear" w:pos="1134"/>
-          <w:tab w:val="left" w:pos="829" w:leader="none"/>
-        </w:tabs>
-        <w:bidi w:val="0"/>
-        <w:spacing w:before="120" w:after="0"/>
-        <w:ind w:hanging="283" w:left="829"/>
-        <w:jc w:val="left"/>
-        <w:rPr/>
-      </w:pPr>
-      <w:r>
-        <w:rPr>
-          <w:rStyle w:val="Strong"/>
-        </w:rPr>
-        <w:t>Shared state lives in the git common directory</w:t>
-      </w:r>
-      <w:r>
-        <w:rPr/>
-        <w:t xml:space="preserve">: the approval receipts, the review ledger and the merge train's queue. Every worktree of a clone sees the same review budget. </w:t>
-      </w:r>
-    </w:p>
-    <w:p>
-      <w:pPr>
-        <w:pStyle w:val="BodyText"/>
-        <w:numPr>
-          <w:ilvl w:val="0"/>
-          <w:numId w:val="5"/>
-        </w:numPr>
-        <w:tabs>
-          <w:tab w:val="clear" w:pos="1134"/>
-          <w:tab w:val="left" w:pos="829" w:leader="none"/>
-        </w:tabs>
-        <w:bidi w:val="0"/>
-        <w:spacing w:before="120" w:after="0"/>
-        <w:ind w:hanging="283" w:left="829"/>
-        <w:jc w:val="left"/>
-        <w:rPr/>
-      </w:pPr>
-      <w:r>
-        <w:rPr>
-          <w:rStyle w:val="Strong"/>
-        </w:rPr>
-        <w:t>The merge train</w:t>
-      </w:r>
-      <w:r>
-        <w:rPr/>
-        <w:t xml:space="preserve"> (</w:t>
-      </w:r>
-      <w:r>
-        <w:rPr>
-          <w:rStyle w:val="SourceText"/>
-        </w:rPr>
-        <w:t>crew_train.py</w:t>
-      </w:r>
-      <w:r>
-        <w:rPr/>
-        <w:t xml:space="preserve">, armed per clone) serialises the gate-and-land stage for tickets whose Touch lists overlap. Catch-up is always a merge, never a rebase. crew never merges, pushes or opens the PR. </w:t>
-      </w:r>
-    </w:p>
-    <w:p>
-      <w:pPr>
-        <w:pStyle w:val="BodyText"/>
-        <w:numPr>
-          <w:ilvl w:val="0"/>
-          <w:numId w:val="5"/>
-        </w:numPr>
-        <w:tabs>
-          <w:tab w:val="clear" w:pos="1134"/>
-          <w:tab w:val="left" w:pos="829" w:leader="none"/>
-        </w:tabs>
-        <w:bidi w:val="0"/>
-        <w:ind w:hanging="283" w:left="829"/>
-        <w:jc w:val="left"/>
-        <w:rPr/>
-      </w:pPr>
-      <w:r>
-        <w:rPr>
-          <w:rStyle w:val="Strong"/>
-        </w:rPr>
-        <w:t>Check before assuming a diff is yours.</w:t>
-      </w:r>
-      <w:r>
-        <w:rPr/>
-        <w:t xml:space="preserve"> Another session may have changed the tree, a branch or the stash (root </w:t>
-      </w:r>
-      <w:r>
-        <w:rPr>
-          <w:rStyle w:val="SourceText"/>
-        </w:rPr>
-        <w:t>CLAUDE.md</w:t>
-      </w:r>
-      <w:r>
-        <w:rPr/>
-        <w:t xml:space="preserve">, "Lessons"). </w:t>
-      </w:r>
-    </w:p>
-    <w:p>
-      <w:pPr>
-        <w:pStyle w:val="BodyText"/>
-        <w:bidi w:val="0"/>
-        <w:jc w:val="left"/>
-        <w:rPr/>
-      </w:pPr>
-      <w:r>
-        <w:rPr/>
-        <w:t>Cross-session coordination claims arrive with T-0030.</w:t>
-      </w:r>
-    </w:p>
-    <w:p>
-      <w:pPr>
-        <w:pStyle w:val="Heading2"/>
-        <w:bidi w:val="0"/>
-        <w:ind w:hanging="0" w:left="0" w:right="0"/>
-        <w:jc w:val="left"/>
-        <w:rPr/>
-      </w:pPr>
-      <w:bookmarkStart w:id="11" w:name="windows"/>
-      <w:bookmarkEnd w:id="11"/>
-      <w:r>
-        <w:rPr/>
-        <w:t>Windows</w:t>
-      </w:r>
-    </w:p>
-    <w:p>
-      <w:pPr>
-        <w:pStyle w:val="BodyText"/>
-        <w:bidi w:val="0"/>
-        <w:jc w:val="left"/>
-        <w:rPr/>
-      </w:pPr>
-      <w:r>
-        <w:rPr/>
-        <w:t xml:space="preserve">Source: </w:t>
-      </w:r>
-      <w:r>
-        <w:rPr>
-          <w:rStyle w:val="SourceText"/>
-        </w:rPr>
-        <w:t>plugin/crew/skills/crew-setup/platform.md</w:t>
-      </w:r>
-      <w:r>
-        <w:rPr/>
-        <w:t xml:space="preserve"> and </w:t>
-      </w:r>
-      <w:r>
-        <w:rPr>
-          <w:rStyle w:val="SourceText"/>
-        </w:rPr>
-        <w:t>CLAUDE.md</w:t>
-      </w:r>
-      <w:r>
-        <w:rPr/>
-        <w:t>, "Landmines".</w:t>
       </w:r>
     </w:p>
     <w:p>
@@ -3252,18 +3299,14 @@
         <w:rPr/>
       </w:pPr>
       <w:r>
-        <w:rPr/>
-        <w:t xml:space="preserve">Every hook is registered twice, once for bash and once with </w:t>
-      </w:r>
-      <w:r>
-        <w:rPr>
-          <w:rStyle w:val="SourceText"/>
-        </w:rPr>
-        <w:t>shell: "powershell"</w:t>
-      </w:r>
-      <w:r>
-        <w:rPr/>
-        <w:t xml:space="preserve">. Each twin stands down on the wrong platform. </w:t>
+        <w:rPr>
+          <w:rStyle w:val="Strong"/>
+        </w:rPr>
+        <w:t>Shared state lives in the git common directory</w:t>
+      </w:r>
+      <w:r>
+        <w:rPr/>
+        <w:t xml:space="preserve">: the approval receipts, the review ledger and the merge train's queue. Every worktree of a clone sees the same review budget. </w:t>
       </w:r>
     </w:p>
     <w:p>
@@ -3285,33 +3328,23 @@
       </w:pPr>
       <w:r>
         <w:rPr>
-          <w:rStyle w:val="SourceText"/>
-        </w:rPr>
-        <w:t>pwsh</w:t>
-      </w:r>
-      <w:r>
-        <w:rPr/>
-        <w:t xml:space="preserve"> is not on Git Bash's </w:t>
-      </w:r>
-      <w:r>
-        <w:rPr>
-          <w:rStyle w:val="SourceText"/>
-        </w:rPr>
-        <w:t>PATH</w:t>
-      </w:r>
-      <w:r>
-        <w:rPr/>
-        <w:t xml:space="preserve">, and Git Bash has no </w:t>
-      </w:r>
-      <w:r>
-        <w:rPr>
-          <w:rStyle w:val="SourceText"/>
-        </w:rPr>
-        <w:t>python3</w:t>
-      </w:r>
-      <w:r>
-        <w:rPr/>
-        <w:t xml:space="preserve">. crew's wrappers resolve both explicitly and fail loudly when neither resolves. </w:t>
+          <w:rStyle w:val="Strong"/>
+        </w:rPr>
+        <w:t>The merge train</w:t>
+      </w:r>
+      <w:r>
+        <w:rPr/>
+        <w:t xml:space="preserve"> (</w:t>
+      </w:r>
+      <w:r>
+        <w:rPr>
+          <w:rStyle w:val="SourceText"/>
+        </w:rPr>
+        <w:t>crew_train.py</w:t>
+      </w:r>
+      <w:r>
+        <w:rPr/>
+        <w:t xml:space="preserve">, armed per clone) serialises the gate-and-land stage for tickets whose Touch lists overlap. Catch-up is always a merge, never a rebase. crew never merges, pushes or opens the PR. </w:t>
       </w:r>
     </w:p>
     <w:p>
@@ -3326,6 +3359,102 @@
           <w:tab w:val="left" w:pos="829" w:leader="none"/>
         </w:tabs>
         <w:bidi w:val="0"/>
+        <w:ind w:hanging="283" w:left="829"/>
+        <w:jc w:val="left"/>
+        <w:rPr/>
+      </w:pPr>
+      <w:r>
+        <w:rPr>
+          <w:rStyle w:val="Strong"/>
+        </w:rPr>
+        <w:t>Check before assuming a diff is yours.</w:t>
+      </w:r>
+      <w:r>
+        <w:rPr/>
+        <w:t xml:space="preserve"> Another session may have changed the tree, a branch or the stash (root </w:t>
+      </w:r>
+      <w:r>
+        <w:rPr>
+          <w:rStyle w:val="SourceText"/>
+        </w:rPr>
+        <w:t>CLAUDE.md</w:t>
+      </w:r>
+      <w:r>
+        <w:rPr/>
+        <w:t xml:space="preserve">, "Lessons"). </w:t>
+      </w:r>
+    </w:p>
+    <w:p>
+      <w:pPr>
+        <w:pStyle w:val="BodyText"/>
+        <w:bidi w:val="0"/>
+        <w:jc w:val="left"/>
+        <w:rPr/>
+      </w:pPr>
+      <w:r>
+        <w:rPr/>
+        <w:t>Cross-session coordination claims arrive with T-0030.</w:t>
+      </w:r>
+    </w:p>
+    <w:p>
+      <w:pPr>
+        <w:pStyle w:val="Heading2"/>
+        <w:bidi w:val="0"/>
+        <w:ind w:hanging="0" w:left="0" w:right="0"/>
+        <w:jc w:val="left"/>
+        <w:rPr/>
+      </w:pPr>
+      <w:bookmarkStart w:id="11" w:name="windows"/>
+      <w:bookmarkEnd w:id="11"/>
+      <w:r>
+        <w:rPr/>
+        <w:t>Windows</w:t>
+      </w:r>
+    </w:p>
+    <w:p>
+      <w:pPr>
+        <w:pStyle w:val="BodyText"/>
+        <w:bidi w:val="0"/>
+        <w:jc w:val="left"/>
+        <w:rPr/>
+      </w:pPr>
+      <w:r>
+        <w:rPr/>
+        <w:t xml:space="preserve">Source: </w:t>
+      </w:r>
+      <w:r>
+        <w:rPr>
+          <w:rStyle w:val="SourceText"/>
+        </w:rPr>
+        <w:t>plugin/crew/skills/crew-setup/platform.md</w:t>
+      </w:r>
+      <w:r>
+        <w:rPr/>
+        <w:t xml:space="preserve"> and </w:t>
+      </w:r>
+      <w:r>
+        <w:rPr>
+          <w:rStyle w:val="SourceText"/>
+        </w:rPr>
+        <w:t>CLAUDE.md</w:t>
+      </w:r>
+      <w:r>
+        <w:rPr/>
+        <w:t>, "Landmines".</w:t>
+      </w:r>
+    </w:p>
+    <w:p>
+      <w:pPr>
+        <w:pStyle w:val="BodyText"/>
+        <w:numPr>
+          <w:ilvl w:val="0"/>
+          <w:numId w:val="7"/>
+        </w:numPr>
+        <w:tabs>
+          <w:tab w:val="clear" w:pos="1134"/>
+          <w:tab w:val="left" w:pos="829" w:leader="none"/>
+        </w:tabs>
+        <w:bidi w:val="0"/>
         <w:spacing w:before="120" w:after="0"/>
         <w:ind w:hanging="283" w:left="829"/>
         <w:jc w:val="left"/>
@@ -3333,77 +3462,17 @@
       </w:pPr>
       <w:r>
         <w:rPr/>
-        <w:t xml:space="preserve">Long jobs follow </w:t>
-      </w:r>
-      <w:r>
-        <w:rPr>
-          <w:rStyle w:val="SourceText"/>
-        </w:rPr>
-        <w:t>shellRoute.mode</w:t>
-      </w:r>
-      <w:r>
-        <w:rPr/>
-        <w:t xml:space="preserve"> (</w:t>
-      </w:r>
-      <w:r>
-        <w:rPr>
-          <w:rStyle w:val="SourceText"/>
-        </w:rPr>
-        <w:t>auto</w:t>
-      </w:r>
-      <w:r>
-        <w:rPr/>
-        <w:t xml:space="preserve">, </w:t>
-      </w:r>
-      <w:r>
-        <w:rPr>
-          <w:rStyle w:val="SourceText"/>
-        </w:rPr>
-        <w:t>wsl</w:t>
-      </w:r>
-      <w:r>
-        <w:rPr/>
-        <w:t xml:space="preserve">, </w:t>
-      </w:r>
-      <w:r>
-        <w:rPr>
-          <w:rStyle w:val="SourceText"/>
-        </w:rPr>
-        <w:t>powershell</w:t>
-      </w:r>
-      <w:r>
-        <w:rPr/>
-        <w:t xml:space="preserve"> or </w:t>
-      </w:r>
-      <w:r>
-        <w:rPr>
-          <w:rStyle w:val="SourceText"/>
-        </w:rPr>
-        <w:t>gitbash</w:t>
-      </w:r>
-      <w:r>
-        <w:rPr/>
-        <w:t xml:space="preserve">). </w:t>
-      </w:r>
-      <w:r>
-        <w:rPr>
-          <w:rStyle w:val="SourceText"/>
-        </w:rPr>
-        <w:t>/crew:status</w:t>
-      </w:r>
-      <w:r>
-        <w:rPr/>
-        <w:t xml:space="preserve">'s </w:t>
-      </w:r>
-      <w:r>
-        <w:rPr>
-          <w:rStyle w:val="SourceText"/>
-        </w:rPr>
-        <w:t>shell</w:t>
-      </w:r>
-      <w:r>
-        <w:rPr/>
-        <w:t xml:space="preserve"> line says which route is in force and why. </w:t>
+        <w:t xml:space="preserve">Every hook is registered twice, once for bash and once with </w:t>
+      </w:r>
+      <w:r>
+        <w:rPr>
+          <w:rStyle w:val="SourceText"/>
+        </w:rPr>
+        <w:t>shell: "powershell"</w:t>
+      </w:r>
+      <w:r>
+        <w:rPr/>
+        <w:t xml:space="preserve">. Each twin stands down on the wrong platform. </w:t>
       </w:r>
     </w:p>
     <w:p>
@@ -3411,7 +3480,147 @@
         <w:pStyle w:val="BodyText"/>
         <w:numPr>
           <w:ilvl w:val="0"/>
-          <w:numId w:val="6"/>
+          <w:numId w:val="7"/>
+        </w:numPr>
+        <w:tabs>
+          <w:tab w:val="clear" w:pos="1134"/>
+          <w:tab w:val="left" w:pos="829" w:leader="none"/>
+        </w:tabs>
+        <w:bidi w:val="0"/>
+        <w:spacing w:before="120" w:after="0"/>
+        <w:ind w:hanging="283" w:left="829"/>
+        <w:jc w:val="left"/>
+        <w:rPr/>
+      </w:pPr>
+      <w:r>
+        <w:rPr>
+          <w:rStyle w:val="SourceText"/>
+        </w:rPr>
+        <w:t>pwsh</w:t>
+      </w:r>
+      <w:r>
+        <w:rPr/>
+        <w:t xml:space="preserve"> is not on Git Bash's </w:t>
+      </w:r>
+      <w:r>
+        <w:rPr>
+          <w:rStyle w:val="SourceText"/>
+        </w:rPr>
+        <w:t>PATH</w:t>
+      </w:r>
+      <w:r>
+        <w:rPr/>
+        <w:t xml:space="preserve">, and Git Bash has no </w:t>
+      </w:r>
+      <w:r>
+        <w:rPr>
+          <w:rStyle w:val="SourceText"/>
+        </w:rPr>
+        <w:t>python3</w:t>
+      </w:r>
+      <w:r>
+        <w:rPr/>
+        <w:t xml:space="preserve">. crew's wrappers resolve both explicitly and fail loudly when neither resolves. </w:t>
+      </w:r>
+    </w:p>
+    <w:p>
+      <w:pPr>
+        <w:pStyle w:val="BodyText"/>
+        <w:numPr>
+          <w:ilvl w:val="0"/>
+          <w:numId w:val="7"/>
+        </w:numPr>
+        <w:tabs>
+          <w:tab w:val="clear" w:pos="1134"/>
+          <w:tab w:val="left" w:pos="829" w:leader="none"/>
+        </w:tabs>
+        <w:bidi w:val="0"/>
+        <w:spacing w:before="120" w:after="0"/>
+        <w:ind w:hanging="283" w:left="829"/>
+        <w:jc w:val="left"/>
+        <w:rPr/>
+      </w:pPr>
+      <w:r>
+        <w:rPr/>
+        <w:t xml:space="preserve">Long jobs follow </w:t>
+      </w:r>
+      <w:r>
+        <w:rPr>
+          <w:rStyle w:val="SourceText"/>
+        </w:rPr>
+        <w:t>shellRoute.mode</w:t>
+      </w:r>
+      <w:r>
+        <w:rPr/>
+        <w:t xml:space="preserve"> (</w:t>
+      </w:r>
+      <w:r>
+        <w:rPr>
+          <w:rStyle w:val="SourceText"/>
+        </w:rPr>
+        <w:t>auto</w:t>
+      </w:r>
+      <w:r>
+        <w:rPr/>
+        <w:t xml:space="preserve">, </w:t>
+      </w:r>
+      <w:r>
+        <w:rPr>
+          <w:rStyle w:val="SourceText"/>
+        </w:rPr>
+        <w:t>wsl</w:t>
+      </w:r>
+      <w:r>
+        <w:rPr/>
+        <w:t xml:space="preserve">, </w:t>
+      </w:r>
+      <w:r>
+        <w:rPr>
+          <w:rStyle w:val="SourceText"/>
+        </w:rPr>
+        <w:t>powershell</w:t>
+      </w:r>
+      <w:r>
+        <w:rPr/>
+        <w:t xml:space="preserve"> or </w:t>
+      </w:r>
+      <w:r>
+        <w:rPr>
+          <w:rStyle w:val="SourceText"/>
+        </w:rPr>
+        <w:t>gitbash</w:t>
+      </w:r>
+      <w:r>
+        <w:rPr/>
+        <w:t xml:space="preserve">). </w:t>
+      </w:r>
+      <w:r>
+        <w:rPr>
+          <w:rStyle w:val="SourceText"/>
+        </w:rPr>
+        <w:t>/crew:status</w:t>
+      </w:r>
+      <w:r>
+        <w:rPr/>
+        <w:t xml:space="preserve">'s </w:t>
+      </w:r>
+      <w:r>
+        <w:rPr>
+          <w:rStyle w:val="SourceText"/>
+        </w:rPr>
+        <w:t>shell</w:t>
+      </w:r>
+      <w:r>
+        <w:rPr/>
+        <w:t xml:space="preserve"> line says which route is in force and why. </w:t>
+      </w:r>
+    </w:p>
+    <w:p>
+      <w:pPr>
+        <w:pStyle w:val="BodyText"/>
+        <w:numPr>
+          <w:ilvl w:val="0"/>
+          <w:numId w:val="7"/>
         </w:numPr>
         <w:tabs>
           <w:tab w:val="clear" w:pos="1134"/>
@@ -3825,7 +4034,7 @@
       </w:r>
       <w:r>
         <w:rPr/>
-        <w:t xml:space="preserve"> Cause: the account's session limit stopped it, not the work. Fix: check what it committed, then resume from the handoff rather than starting again.</w:t>
+        <w:t xml:space="preserve"> Possible cause: something outside the work stopped it, such as a usage or session limit on the account. Fix: check what it committed, then resume from the handoff rather than starting again.</w:t>
       </w:r>
     </w:p>
     <w:p>
@@ -3855,7 +4064,7 @@
       </w:r>
       <w:r>
         <w:rPr/>
-        <w:t xml:space="preserve"> Cause: on a snap install, a torn write left a corrupt </w:t>
+        <w:t xml:space="preserve"> Cause: a corrupt </w:t>
       </w:r>
       <w:r>
         <w:rPr>
@@ -3875,7 +4084,27 @@
       </w:r>
       <w:r>
         <w:rPr/>
-        <w:t>. Fix: move that file aside; pwsh rebuilds it on the next start. Ticket T-0506 tracks the cause.</w:t>
+        <w:t xml:space="preserve">. The leading explanation, not yet confirmed, is a torn write: several pwsh processes (a snap install, here) rewriting that one file at once. Fix: move that file aside; pwsh rebuilds it on the next start. crew's own test suites now give every pwsh they spawn a throwaway </w:t>
+      </w:r>
+      <w:r>
+        <w:rPr>
+          <w:rStyle w:val="SourceText"/>
+        </w:rPr>
+        <w:t>XDG_CACHE_HOME</w:t>
+      </w:r>
+      <w:r>
+        <w:rPr/>
+        <w:t>, so they cannot corrupt it (</w:t>
+      </w:r>
+      <w:r>
+        <w:rPr>
+          <w:rStyle w:val="SourceText"/>
+        </w:rPr>
+        <w:t>plugin/crew/README.md</w:t>
+      </w:r>
+      <w:r>
+        <w:rPr/>
+        <w:t>, section 25). Ticket T-0506 tracks the cause.</w:t>
       </w:r>
     </w:p>
     <w:p>
@@ -4821,7 +5050,7 @@
         <w:pStyle w:val="BodyText"/>
         <w:numPr>
           <w:ilvl w:val="0"/>
-          <w:numId w:val="7"/>
+          <w:numId w:val="8"/>
         </w:numPr>
         <w:tabs>
           <w:tab w:val="clear" w:pos="1134"/>
@@ -4849,7 +5078,7 @@
         <w:pStyle w:val="BodyText"/>
         <w:numPr>
           <w:ilvl w:val="0"/>
-          <w:numId w:val="7"/>
+          <w:numId w:val="8"/>
         </w:numPr>
         <w:tabs>
           <w:tab w:val="clear" w:pos="1134"/>
@@ -4883,7 +5112,7 @@
         <w:pStyle w:val="BodyText"/>
         <w:numPr>
           <w:ilvl w:val="0"/>
-          <w:numId w:val="7"/>
+          <w:numId w:val="8"/>
         </w:numPr>
         <w:tabs>
           <w:tab w:val="clear" w:pos="1134"/>
@@ -5863,6 +6092,143 @@
     </w:lvl>
   </w:abstractNum>
   <w:abstractNum w:abstractNumId="8">
+    <w:lvl w:ilvl="0">
+      <w:start w:val="1"/>
+      <w:numFmt w:val="bullet"/>
+      <w:lvlText w:val=""/>
+      <w:lvlJc w:val="left"/>
+      <w:pPr>
+        <w:tabs>
+          <w:tab w:val="num" w:pos="709"/>
+        </w:tabs>
+        <w:ind w:left="709" w:hanging="283"/>
+      </w:pPr>
+      <w:rPr>
+        <w:rFonts w:ascii="Symbol" w:hAnsi="Symbol" w:cs="Symbol" w:hint="default"/>
+      </w:rPr>
+    </w:lvl>
+    <w:lvl w:ilvl="1">
+      <w:start w:val="1"/>
+      <w:numFmt w:val="bullet"/>
+      <w:lvlText w:val=""/>
+      <w:lvlJc w:val="left"/>
+      <w:pPr>
+        <w:tabs>
+          <w:tab w:val="num" w:pos="1418"/>
+        </w:tabs>
+        <w:ind w:left="1418" w:hanging="283"/>
+      </w:pPr>
+      <w:rPr>
+        <w:rFonts w:ascii="Symbol" w:hAnsi="Symbol" w:cs="Symbol" w:hint="default"/>
+      </w:rPr>
+    </w:lvl>
+    <w:lvl w:ilvl="2">
+      <w:start w:val="1"/>
+      <w:numFmt w:val="bullet"/>
+      <w:lvlText w:val=""/>
+      <w:lvlJc w:val="left"/>
+      <w:pPr>
+        <w:tabs>
+          <w:tab w:val="num" w:pos="2127"/>
+        </w:tabs>
+        <w:ind w:left="2127" w:hanging="283"/>
+      </w:pPr>
+      <w:rPr>
+        <w:rFonts w:ascii="Symbol" w:hAnsi="Symbol" w:cs="Symbol" w:hint="default"/>
+      </w:rPr>
+    </w:lvl>
+    <w:lvl w:ilvl="3">
+      <w:start w:val="1"/>
+      <w:numFmt w:val="bullet"/>
+      <w:lvlText w:val=""/>
+      <w:lvlJc w:val="left"/>
+      <w:pPr>
+        <w:tabs>
+          <w:tab w:val="num" w:pos="2836"/>
+        </w:tabs>
+        <w:ind w:left="2836" w:hanging="283"/>
+      </w:pPr>
+      <w:rPr>
+        <w:rFonts w:ascii="Symbol" w:hAnsi="Symbol" w:cs="Symbol" w:hint="default"/>
+      </w:rPr>
+    </w:lvl>
+    <w:lvl w:ilvl="4">
+      <w:start w:val="1"/>
+      <w:numFmt w:val="bullet"/>
+      <w:lvlText w:val=""/>
+      <w:lvlJc w:val="left"/>
+      <w:pPr>
+        <w:tabs>
+          <w:tab w:val="num" w:pos="3545"/>
+        </w:tabs>
+        <w:ind w:left="3545" w:hanging="283"/>
+      </w:pPr>
+      <w:rPr>
+        <w:rFonts w:ascii="Symbol" w:hAnsi="Symbol" w:cs="Symbol" w:hint="default"/>
+      </w:rPr>
+    </w:lvl>
+    <w:lvl w:ilvl="5">
+      <w:start w:val="1"/>
+      <w:numFmt w:val="bullet"/>
+      <w:lvlText w:val=""/>
+      <w:lvlJc w:val="left"/>
+      <w:pPr>
+        <w:tabs>
+          <w:tab w:val="num" w:pos="4254"/>
+        </w:tabs>
+        <w:ind w:left="4254" w:hanging="283"/>
+      </w:pPr>
+      <w:rPr>
+        <w:rFonts w:ascii="Symbol" w:hAnsi="Symbol" w:cs="Symbol" w:hint="default"/>
+      </w:rPr>
+    </w:lvl>
+    <w:lvl w:ilvl="6">
+      <w:start w:val="1"/>
+      <w:numFmt w:val="bullet"/>
+      <w:lvlText w:val=""/>
+      <w:lvlJc w:val="left"/>
+      <w:pPr>
+        <w:tabs>
+          <w:tab w:val="num" w:pos="4963"/>
+        </w:tabs>
+        <w:ind w:left="4963" w:hanging="283"/>
+      </w:pPr>
+      <w:rPr>
+        <w:rFonts w:ascii="Symbol" w:hAnsi="Symbol" w:cs="Symbol" w:hint="default"/>
+      </w:rPr>
+    </w:lvl>
+    <w:lvl w:ilvl="7">
+      <w:start w:val="1"/>
+      <w:numFmt w:val="bullet"/>
+      <w:lvlText w:val=""/>
+      <w:lvlJc w:val="left"/>
+      <w:pPr>
+        <w:tabs>
+          <w:tab w:val="num" w:pos="5672"/>
+        </w:tabs>
+        <w:ind w:left="5672" w:hanging="283"/>
+      </w:pPr>
+      <w:rPr>
+        <w:rFonts w:ascii="Symbol" w:hAnsi="Symbol" w:cs="Symbol" w:hint="default"/>
+      </w:rPr>
+    </w:lvl>
+    <w:lvl w:ilvl="8">
+      <w:start w:val="1"/>
+      <w:numFmt w:val="bullet"/>
+      <w:lvlText w:val=""/>
+      <w:lvlJc w:val="left"/>
+      <w:pPr>
+        <w:tabs>
+          <w:tab w:val="num" w:pos="6381"/>
+        </w:tabs>
+        <w:ind w:left="6381" w:hanging="283"/>
+      </w:pPr>
+      <w:rPr>
+        <w:rFonts w:ascii="Symbol" w:hAnsi="Symbol" w:cs="Symbol" w:hint="default"/>
+      </w:rPr>
+    </w:lvl>
+  </w:abstractNum>
+  <w:abstractNum w:abstractNumId="9">
     <w:lvl w:ilvl="0">
       <w:start w:val="1"/>
       <w:numFmt w:val="none"/>
@@ -6006,6 +6372,9 @@
   </w:num>
   <w:num w:numId="8">
     <w:abstractNumId w:val="8"/>
+  </w:num>
+  <w:num w:numId="9">
+    <w:abstractNumId w:val="9"/>
   </w:num>
 </w:numbering>
 </file>

</xml_diff>

<commit_message>
T-0020: the full guide describes /crew:autopilot focus as shipped
guide.md's "Autopilot today" gains focus (writes the active-ticket pointer
and .crew/.scope-base, refuses other tickets, drift stop, focus off); the
T-0020 row leaves "What is coming". Guide HTML/DOCX/PDF rebuilt.

Claude-Session: https://claude.ai/code/session_016wQA2o38aSB65bpjaGpMVJ
</commit_message>
<xml_diff>
--- a/docs/guides/crew/crew-1.0-guide.docx
+++ b/docs/guides/crew/crew-1.0-guide.docx
@@ -2987,6 +2987,114 @@
         <w:rPr/>
       </w:pPr>
       <w:r>
+        <w:rPr>
+          <w:rStyle w:val="SourceText"/>
+        </w:rPr>
+        <w:t>/crew:autopilot focus &lt;id&gt;</w:t>
+      </w:r>
+      <w:r>
+        <w:rPr/>
+        <w:t xml:space="preserve"> locks autopilot onto one ticket. It writes this worktree's active-ticket pointer and </w:t>
+      </w:r>
+      <w:r>
+        <w:rPr>
+          <w:rStyle w:val="SourceText"/>
+        </w:rPr>
+        <w:t>.crew/.scope-base</w:t>
+      </w:r>
+      <w:r>
+        <w:rPr/>
+        <w:t xml:space="preserve">, and prints the scope-base line. While focused, autopilot refuses to run another ticket, </w:t>
+      </w:r>
+      <w:r>
+        <w:rPr>
+          <w:rStyle w:val="SourceText"/>
+        </w:rPr>
+        <w:t>assign</w:t>
+      </w:r>
+      <w:r>
+        <w:rPr/>
+        <w:t xml:space="preserve"> and </w:t>
+      </w:r>
+      <w:r>
+        <w:rPr>
+          <w:rStyle w:val="SourceText"/>
+        </w:rPr>
+        <w:t>goal</w:t>
+      </w:r>
+      <w:r>
+        <w:rPr/>
+        <w:t xml:space="preserve">; once the plan is approved, </w:t>
+      </w:r>
+      <w:r>
+        <w:rPr>
+          <w:rStyle w:val="SourceText"/>
+        </w:rPr>
+        <w:t>next</w:t>
+      </w:r>
+      <w:r>
+        <w:rPr/>
+        <w:t xml:space="preserve"> stops as </w:t>
+      </w:r>
+      <w:r>
+        <w:rPr>
+          <w:rStyle w:val="SourceText"/>
+        </w:rPr>
+        <w:t>drift</w:t>
+      </w:r>
+      <w:r>
+        <w:rPr/>
+        <w:t xml:space="preserve"> on a changed path outside the plan's Touch list, or when that check could not run. </w:t>
+      </w:r>
+      <w:r>
+        <w:rPr>
+          <w:rStyle w:val="SourceText"/>
+        </w:rPr>
+        <w:t>focus --findings --ticket &lt;id&gt;</w:t>
+      </w:r>
+      <w:r>
+        <w:rPr/>
+        <w:t xml:space="preserve"> names where an out-of-scope finding goes. </w:t>
+      </w:r>
+      <w:r>
+        <w:rPr>
+          <w:rStyle w:val="SourceText"/>
+        </w:rPr>
+        <w:t>/crew:autopilot focus</w:t>
+      </w:r>
+      <w:r>
+        <w:rPr/>
+        <w:t xml:space="preserve"> shows the lock and </w:t>
+      </w:r>
+      <w:r>
+        <w:rPr>
+          <w:rStyle w:val="SourceText"/>
+        </w:rPr>
+        <w:t>/crew:autopilot focus off</w:t>
+      </w:r>
+      <w:r>
+        <w:rPr/>
+        <w:t xml:space="preserve"> releases it. Claude Code's built-in </w:t>
+      </w:r>
+      <w:r>
+        <w:rPr>
+          <w:rStyle w:val="SourceText"/>
+        </w:rPr>
+        <w:t>/focus</w:t>
+      </w:r>
+      <w:r>
+        <w:rPr/>
+        <w:t xml:space="preserve"> is unrelated: it only toggles the display.</w:t>
+      </w:r>
+    </w:p>
+    <w:p>
+      <w:pPr>
+        <w:pStyle w:val="BodyText"/>
+        <w:bidi w:val="0"/>
+        <w:jc w:val="left"/>
+        <w:rPr/>
+      </w:pPr>
+      <w:r>
         <w:rPr/>
         <w:t>A separate autopilot guide with worked examples is planned as T-0054.</w:t>
       </w:r>
@@ -4519,53 +4627,6 @@
                 <w:rStyle w:val="SourceText"/>
               </w:rPr>
               <w:t>/crew:autopilot assign</w:t>
-            </w:r>
-          </w:p>
-        </w:tc>
-      </w:tr>
-      <w:tr>
-        <w:trPr/>
-        <w:tc>
-          <w:tcPr>
-            <w:tcW w:w="1007" w:type="dxa"/>
-            <w:tcBorders/>
-            <w:vAlign w:val="center"/>
-          </w:tcPr>
-          <w:p>
-            <w:pPr>
-              <w:pStyle w:val="TableContents"/>
-              <w:shd w:fill="2E3440" w:val="clear"/>
-              <w:bidi w:val="0"/>
-              <w:spacing w:before="120" w:after="120"/>
-              <w:jc w:val="left"/>
-              <w:rPr/>
-            </w:pPr>
-            <w:r>
-              <w:rPr/>
-              <w:t>T-0020</w:t>
-            </w:r>
-          </w:p>
-        </w:tc>
-        <w:tc>
-          <w:tcPr>
-            <w:tcW w:w="2881" w:type="dxa"/>
-            <w:tcBorders/>
-            <w:vAlign w:val="center"/>
-          </w:tcPr>
-          <w:p>
-            <w:pPr>
-              <w:pStyle w:val="TableContents"/>
-              <w:shd w:fill="2E3440" w:val="clear"/>
-              <w:bidi w:val="0"/>
-              <w:spacing w:before="120" w:after="120"/>
-              <w:jc w:val="left"/>
-              <w:rPr/>
-            </w:pPr>
-            <w:r>
-              <w:rPr>
-                <w:rStyle w:val="SourceText"/>
-              </w:rPr>
-              <w:t>/crew:autopilot focus</w:t>
             </w:r>
           </w:p>
         </w:tc>

</xml_diff>

<commit_message>
T-0036: code map, guide, QA docs, CHANGELOG and TODO follow-ups; ticket files removed
The crew code map records the reference kind, crew_reference.py and the
fifth refresh-artifact dir; the crew guide names the integrations doc
among the refresh artifacts (rebuilt); qa_doc.py regenerated the QA page
and diagrams for the new verify rule. TODO.md files the follow-ups,
the harness ones (sabotage registrations, an artifact_verdicts reference
kind) among them. docs/tickets/T-0036 ships as code and CHANGELOG.

Claude-Session: https://claude.ai/code/session_016wQA2o38aSB65bpjaGpMVJ
</commit_message>
<xml_diff>
--- a/docs/guides/crew/crew-1.0-guide.docx
+++ b/docs/guides/crew/crew-1.0-guide.docx
@@ -1986,7 +1986,7 @@
       </w:r>
       <w:r>
         <w:rPr/>
-        <w:t xml:space="preserve">, and the generated </w:t>
+        <w:t xml:space="preserve">, the generated </w:t>
       </w:r>
       <w:r>
         <w:rPr>
@@ -1996,7 +1996,27 @@
       </w:r>
       <w:r>
         <w:rPr/>
-        <w:t>. The order is fixed: implement, then refresh, then review, then done.</w:t>
+        <w:t xml:space="preserve">, and the integrations reference </w:t>
+      </w:r>
+      <w:r>
+        <w:rPr>
+          <w:rStyle w:val="SourceText"/>
+        </w:rPr>
+        <w:t>docs/reference/integrations.md</w:t>
+      </w:r>
+      <w:r>
+        <w:rPr/>
+        <w:t xml:space="preserve"> that </w:t>
+      </w:r>
+      <w:r>
+        <w:rPr>
+          <w:rStyle w:val="SourceText"/>
+        </w:rPr>
+        <w:t>/crew:reference --integrations</w:t>
+      </w:r>
+      <w:r>
+        <w:rPr/>
+        <w:t xml:space="preserve"> writes. The order is fixed: implement, then refresh, then review, then done.</w:t>
       </w:r>
     </w:p>
     <w:p>
@@ -2051,6 +2071,16 @@
           <w:rStyle w:val="SourceText"/>
         </w:rPr>
         <w:t>/crew:diagram refresh</w:t>
+      </w:r>
+      <w:r>
+        <w:rPr/>
+        <w:t xml:space="preserve">, </w:t>
+      </w:r>
+      <w:r>
+        <w:rPr>
+          <w:rStyle w:val="SourceText"/>
+        </w:rPr>
+        <w:t>/crew:reference --integrations</w:t>
       </w:r>
       <w:r>
         <w:rPr/>

</xml_diff>

<commit_message>
T-0036: the crew guide names the integrations doc without a path HEAD lacks
scripts/_test/crew-guide.py refuses a backticked path that is not at HEAD;
docs/reference/integrations.md exists only in a repo that ran the command.

Claude-Session: https://claude.ai/code/session_016wQA2o38aSB65bpjaGpMVJ
</commit_message>
<xml_diff>
--- a/docs/guides/crew/crew-1.0-guide.docx
+++ b/docs/guides/crew/crew-1.0-guide.docx
@@ -1996,17 +1996,7 @@
       </w:r>
       <w:r>
         <w:rPr/>
-        <w:t xml:space="preserve">, and the integrations reference </w:t>
-      </w:r>
-      <w:r>
-        <w:rPr>
-          <w:rStyle w:val="SourceText"/>
-        </w:rPr>
-        <w:t>docs/reference/integrations.md</w:t>
-      </w:r>
-      <w:r>
-        <w:rPr/>
-        <w:t xml:space="preserve"> that </w:t>
+        <w:t xml:space="preserve">, and the integrations reference (docs/reference/integrations.md) that </w:t>
       </w:r>
       <w:r>
         <w:rPr>

</xml_diff>